<commit_message>
recent lab changes: 2026-04-26 16:14:23
</commit_message>
<xml_diff>
--- a/Курс 3/Архитектура ЭВМ/Лабораторные/05. Командный цикл процессора/Документ Microsoft Word.docx
+++ b/Курс 3/Архитектура ЭВМ/Лабораторные/05. Командный цикл процессора/Документ Microsoft Word.docx
@@ -1,6 +1,6 @@
 
 <file path=word/document.xml><?xml version="1.0" encoding="utf-8"?>
-<w:document xmlns:wpc="http://schemas.microsoft.com/office/word/2010/wordprocessingCanvas" xmlns:cx="http://schemas.microsoft.com/office/drawing/2014/chartex" xmlns:cx1="http://schemas.microsoft.com/office/drawing/2015/9/8/chartex" xmlns:cx2="http://schemas.microsoft.com/office/drawing/2015/10/21/chartex" xmlns:cx3="http://schemas.microsoft.com/office/drawing/2016/5/9/chartex" xmlns:cx4="http://schemas.microsoft.com/office/drawing/2016/5/10/chartex" xmlns:cx5="http://schemas.microsoft.com/office/drawing/2016/5/11/chartex" xmlns:cx6="http://schemas.microsoft.com/office/drawing/2016/5/12/chartex" xmlns:cx7="http://schemas.microsoft.com/office/drawing/2016/5/13/chartex" xmlns:cx8="http://schemas.microsoft.com/office/drawing/2016/5/14/chartex" xmlns:mc="http://schemas.openxmlformats.org/markup-compatibility/2006" xmlns:aink="http://schemas.microsoft.com/office/drawing/2016/ink" xmlns:am3d="http://schemas.microsoft.com/office/drawing/2017/model3d" xmlns:o="urn:schemas-microsoft-com:office:office" xmlns:oel="http://schemas.microsoft.com/office/2019/extlst" xmlns:r="http://schemas.openxmlformats.org/officeDocument/2006/relationships" xmlns:m="http://schemas.openxmlformats.org/officeDocument/2006/math" xmlns:v="urn:schemas-microsoft-com:vml" xmlns:wp14="http://schemas.microsoft.com/office/word/2010/wordprocessingDrawing" xmlns:wp="http://schemas.openxmlformats.org/drawingml/2006/wordprocessingDrawing" xmlns:w10="urn:schemas-microsoft-com:office:word" xmlns:w="http://schemas.openxmlformats.org/wordprocessingml/2006/main" xmlns:w14="http://schemas.microsoft.com/office/word/2010/wordml" xmlns:w15="http://schemas.microsoft.com/office/word/2012/wordml" xmlns:w16cex="http://schemas.microsoft.com/office/word/2018/wordml/cex" xmlns:w16cid="http://schemas.microsoft.com/office/word/2016/wordml/cid" xmlns:w16="http://schemas.microsoft.com/office/word/2018/wordml" xmlns:w16du="http://schemas.microsoft.com/office/word/2023/wordml/word16du" xmlns:w16sdtdh="http://schemas.microsoft.com/office/word/2020/wordml/sdtdatahash" xmlns:w16sdtfl="http://schemas.microsoft.com/office/word/2024/wordml/sdtformatlock" xmlns:w16se="http://schemas.microsoft.com/office/word/2015/wordml/symex" xmlns:wpg="http://schemas.microsoft.com/office/word/2010/wordprocessingGroup" xmlns:wpi="http://schemas.microsoft.com/office/word/2010/wordprocessingInk" xmlns:wne="http://schemas.microsoft.com/office/word/2006/wordml" xmlns:wps="http://schemas.microsoft.com/office/word/2010/wordprocessingShape" mc:Ignorable="w14 w15 w16se w16cid w16 w16cex w16sdtdh w16sdtfl w16du wp14">
+<w:document xmlns:wpc="http://schemas.microsoft.com/office/word/2010/wordprocessingCanvas" xmlns:cx="http://schemas.microsoft.com/office/drawing/2014/chartex" xmlns:mc="http://schemas.openxmlformats.org/markup-compatibility/2006" xmlns:o="urn:schemas-microsoft-com:office:office" xmlns:r="http://schemas.openxmlformats.org/officeDocument/2006/relationships" xmlns:m="http://schemas.openxmlformats.org/officeDocument/2006/math" xmlns:v="urn:schemas-microsoft-com:vml" xmlns:wp14="http://schemas.microsoft.com/office/word/2010/wordprocessingDrawing" xmlns:wp="http://schemas.openxmlformats.org/drawingml/2006/wordprocessingDrawing" xmlns:w10="urn:schemas-microsoft-com:office:word" xmlns:w="http://schemas.openxmlformats.org/wordprocessingml/2006/main" xmlns:w14="http://schemas.microsoft.com/office/word/2010/wordml" xmlns:w15="http://schemas.microsoft.com/office/word/2012/wordml" xmlns:w16se="http://schemas.microsoft.com/office/word/2015/wordml/symex" xmlns:wpg="http://schemas.microsoft.com/office/word/2010/wordprocessingGroup" xmlns:wpi="http://schemas.microsoft.com/office/word/2010/wordprocessingInk" xmlns:wne="http://schemas.microsoft.com/office/word/2006/wordml" xmlns:wps="http://schemas.microsoft.com/office/word/2010/wordprocessingShape" mc:Ignorable="w14 w15 w16se wp14">
   <w:body>
     <w:p>
       <w:pPr>
@@ -1181,6 +1181,7 @@
                 <w:lang w:val="en-US"/>
               </w:rPr>
             </w:pPr>
+            <w:proofErr w:type="spellStart"/>
             <w:r>
               <w:rPr>
                 <w:rFonts w:cs="Times New Roman"/>
@@ -1191,6 +1192,7 @@
               </w:rPr>
               <w:t>Acc</w:t>
             </w:r>
+            <w:proofErr w:type="spellEnd"/>
           </w:p>
         </w:tc>
         <w:tc>
@@ -2600,14 +2602,25 @@
                 <w:lang w:val="en-US"/>
               </w:rPr>
             </w:pPr>
-            <w:r>
-              <w:rPr>
-                <w:rFonts w:cs="Times New Roman"/>
-                <w:sz w:val="24"/>
-                <w:szCs w:val="24"/>
-                <w:lang w:val="en-US"/>
-              </w:rPr>
-              <w:t>Acc := IR</w:t>
+            <w:proofErr w:type="spellStart"/>
+            <w:r>
+              <w:rPr>
+                <w:rFonts w:cs="Times New Roman"/>
+                <w:sz w:val="24"/>
+                <w:szCs w:val="24"/>
+                <w:lang w:val="en-US"/>
+              </w:rPr>
+              <w:t>Acc</w:t>
+            </w:r>
+            <w:proofErr w:type="spellEnd"/>
+            <w:r>
+              <w:rPr>
+                <w:rFonts w:cs="Times New Roman"/>
+                <w:sz w:val="24"/>
+                <w:szCs w:val="24"/>
+                <w:lang w:val="en-US"/>
+              </w:rPr>
+              <w:t xml:space="preserve"> := IR</w:t>
             </w:r>
           </w:p>
         </w:tc>
@@ -9181,13 +9194,23 @@
                 <w:szCs w:val="24"/>
               </w:rPr>
             </w:pPr>
-            <w:r>
-              <w:rPr>
-                <w:rFonts w:cs="Times New Roman"/>
-                <w:sz w:val="24"/>
-                <w:szCs w:val="24"/>
-              </w:rPr>
-              <w:t>Start ALU</w:t>
+            <w:proofErr w:type="spellStart"/>
+            <w:r>
+              <w:rPr>
+                <w:rFonts w:cs="Times New Roman"/>
+                <w:sz w:val="24"/>
+                <w:szCs w:val="24"/>
+              </w:rPr>
+              <w:t>Start</w:t>
+            </w:r>
+            <w:proofErr w:type="spellEnd"/>
+            <w:r>
+              <w:rPr>
+                <w:rFonts w:cs="Times New Roman"/>
+                <w:sz w:val="24"/>
+                <w:szCs w:val="24"/>
+              </w:rPr>
+              <w:t xml:space="preserve"> ALU</w:t>
             </w:r>
           </w:p>
         </w:tc>
@@ -11196,31 +11219,6 @@
               </w:rPr>
               <w:t>Запись требуемого номера регистра</w:t>
             </w:r>
-            <w:r>
-              <w:rPr>
-                <w:rFonts w:cs="Times New Roman"/>
-                <w:sz w:val="24"/>
-                <w:szCs w:val="24"/>
-              </w:rPr>
-              <w:t xml:space="preserve"> </w:t>
-            </w:r>
-            <w:r>
-              <w:rPr>
-                <w:rFonts w:cs="Times New Roman"/>
-                <w:sz w:val="24"/>
-                <w:szCs w:val="24"/>
-              </w:rPr>
-              <w:t xml:space="preserve">из 5 бита </w:t>
-            </w:r>
-            <w:r>
-              <w:rPr>
-                <w:rFonts w:cs="Times New Roman"/>
-                <w:sz w:val="24"/>
-                <w:szCs w:val="24"/>
-                <w:lang w:val="en-US"/>
-              </w:rPr>
-              <w:t>CR</w:t>
-            </w:r>
           </w:p>
         </w:tc>
       </w:tr>
@@ -11855,31 +11853,6 @@
               </w:rPr>
               <w:t>Запись требуемого номера регистра</w:t>
             </w:r>
-            <w:r>
-              <w:rPr>
-                <w:rFonts w:cs="Times New Roman"/>
-                <w:sz w:val="24"/>
-                <w:szCs w:val="24"/>
-              </w:rPr>
-              <w:t xml:space="preserve"> </w:t>
-            </w:r>
-            <w:r>
-              <w:rPr>
-                <w:rFonts w:cs="Times New Roman"/>
-                <w:sz w:val="24"/>
-                <w:szCs w:val="24"/>
-              </w:rPr>
-              <w:t xml:space="preserve">из 5 бита </w:t>
-            </w:r>
-            <w:r>
-              <w:rPr>
-                <w:rFonts w:cs="Times New Roman"/>
-                <w:sz w:val="24"/>
-                <w:szCs w:val="24"/>
-                <w:lang w:val="en-US"/>
-              </w:rPr>
-              <w:t>CR</w:t>
-            </w:r>
           </w:p>
         </w:tc>
       </w:tr>
@@ -12249,7 +12222,23 @@
                 <w:sz w:val="24"/>
                 <w:szCs w:val="24"/>
               </w:rPr>
-              <w:t>Запись прочитанного из памяти значения в операнд</w:t>
+              <w:t xml:space="preserve">Запись прочитанного из </w:t>
+            </w:r>
+            <w:r>
+              <w:rPr>
+                <w:rFonts w:cs="Times New Roman"/>
+                <w:sz w:val="24"/>
+                <w:szCs w:val="24"/>
+              </w:rPr>
+              <w:t>памяти</w:t>
+            </w:r>
+            <w:r>
+              <w:rPr>
+                <w:rFonts w:cs="Times New Roman"/>
+                <w:sz w:val="24"/>
+                <w:szCs w:val="24"/>
+              </w:rPr>
+              <w:t xml:space="preserve"> значения в операнд</w:t>
             </w:r>
           </w:p>
         </w:tc>
@@ -12753,31 +12742,6 @@
               </w:rPr>
               <w:t>Запись требуемого номера регистра</w:t>
             </w:r>
-            <w:r>
-              <w:rPr>
-                <w:rFonts w:cs="Times New Roman"/>
-                <w:sz w:val="24"/>
-                <w:szCs w:val="24"/>
-              </w:rPr>
-              <w:t xml:space="preserve"> </w:t>
-            </w:r>
-            <w:r>
-              <w:rPr>
-                <w:rFonts w:cs="Times New Roman"/>
-                <w:sz w:val="24"/>
-                <w:szCs w:val="24"/>
-              </w:rPr>
-              <w:t xml:space="preserve">из 5 бита </w:t>
-            </w:r>
-            <w:r>
-              <w:rPr>
-                <w:rFonts w:cs="Times New Roman"/>
-                <w:sz w:val="24"/>
-                <w:szCs w:val="24"/>
-                <w:lang w:val="en-US"/>
-              </w:rPr>
-              <w:t>CR</w:t>
-            </w:r>
           </w:p>
         </w:tc>
       </w:tr>
@@ -13007,7 +12971,31 @@
                 <w:sz w:val="24"/>
                 <w:szCs w:val="24"/>
               </w:rPr>
-              <w:t>Запись номера необходимой ячейки памяти</w:t>
+              <w:t>Запись н</w:t>
+            </w:r>
+            <w:r>
+              <w:rPr>
+                <w:rFonts w:cs="Times New Roman"/>
+                <w:sz w:val="24"/>
+                <w:szCs w:val="24"/>
+              </w:rPr>
+              <w:t>омер</w:t>
+            </w:r>
+            <w:r>
+              <w:rPr>
+                <w:rFonts w:cs="Times New Roman"/>
+                <w:sz w:val="24"/>
+                <w:szCs w:val="24"/>
+              </w:rPr>
+              <w:t>а</w:t>
+            </w:r>
+            <w:r>
+              <w:rPr>
+                <w:rFonts w:cs="Times New Roman"/>
+                <w:sz w:val="24"/>
+                <w:szCs w:val="24"/>
+              </w:rPr>
+              <w:t xml:space="preserve"> необходимой ячейки памяти</w:t>
             </w:r>
           </w:p>
         </w:tc>
@@ -13720,31 +13708,6 @@
               </w:rPr>
               <w:t>Запись требуемого номера регистра</w:t>
             </w:r>
-            <w:r>
-              <w:rPr>
-                <w:rFonts w:cs="Times New Roman"/>
-                <w:sz w:val="24"/>
-                <w:szCs w:val="24"/>
-              </w:rPr>
-              <w:t xml:space="preserve"> </w:t>
-            </w:r>
-            <w:r>
-              <w:rPr>
-                <w:rFonts w:cs="Times New Roman"/>
-                <w:sz w:val="24"/>
-                <w:szCs w:val="24"/>
-              </w:rPr>
-              <w:t xml:space="preserve">из 5 бита </w:t>
-            </w:r>
-            <w:r>
-              <w:rPr>
-                <w:rFonts w:cs="Times New Roman"/>
-                <w:sz w:val="24"/>
-                <w:szCs w:val="24"/>
-                <w:lang w:val="en-US"/>
-              </w:rPr>
-              <w:t>CR</w:t>
-            </w:r>
           </w:p>
         </w:tc>
       </w:tr>
@@ -14306,13 +14269,23 @@
                 <w:szCs w:val="24"/>
               </w:rPr>
             </w:pPr>
-            <w:r>
-              <w:rPr>
-                <w:rFonts w:cs="Times New Roman"/>
-                <w:sz w:val="24"/>
-                <w:szCs w:val="24"/>
-              </w:rPr>
-              <w:t>Start ALU</w:t>
+            <w:proofErr w:type="spellStart"/>
+            <w:r>
+              <w:rPr>
+                <w:rFonts w:cs="Times New Roman"/>
+                <w:sz w:val="24"/>
+                <w:szCs w:val="24"/>
+              </w:rPr>
+              <w:t>Start</w:t>
+            </w:r>
+            <w:proofErr w:type="spellEnd"/>
+            <w:r>
+              <w:rPr>
+                <w:rFonts w:cs="Times New Roman"/>
+                <w:sz w:val="24"/>
+                <w:szCs w:val="24"/>
+              </w:rPr>
+              <w:t xml:space="preserve"> ALU</w:t>
             </w:r>
           </w:p>
         </w:tc>
@@ -14678,47 +14651,6 @@
               </w:rPr>
               <w:t>Запись требуемого номера регистра</w:t>
             </w:r>
-            <w:r>
-              <w:rPr>
-                <w:rFonts w:cs="Times New Roman"/>
-                <w:sz w:val="24"/>
-                <w:szCs w:val="24"/>
-              </w:rPr>
-              <w:t xml:space="preserve"> </w:t>
-            </w:r>
-            <w:r>
-              <w:rPr>
-                <w:rFonts w:cs="Times New Roman"/>
-                <w:sz w:val="24"/>
-                <w:szCs w:val="24"/>
-              </w:rPr>
-              <w:t xml:space="preserve">из </w:t>
-            </w:r>
-            <w:r>
-              <w:rPr>
-                <w:rFonts w:cs="Times New Roman"/>
-                <w:sz w:val="24"/>
-                <w:szCs w:val="24"/>
-              </w:rPr>
-              <w:t>2</w:t>
-            </w:r>
-            <w:r>
-              <w:rPr>
-                <w:rFonts w:cs="Times New Roman"/>
-                <w:sz w:val="24"/>
-                <w:szCs w:val="24"/>
-              </w:rPr>
-              <w:t xml:space="preserve"> бита </w:t>
-            </w:r>
-            <w:r>
-              <w:rPr>
-                <w:rFonts w:cs="Times New Roman"/>
-                <w:sz w:val="24"/>
-                <w:szCs w:val="24"/>
-                <w:lang w:val="en-US"/>
-              </w:rPr>
-              <w:t>CR</w:t>
-            </w:r>
           </w:p>
         </w:tc>
       </w:tr>
@@ -15219,23 +15151,6 @@
               </w:rPr>
               <w:t>Запись требуемого номера регистра</w:t>
             </w:r>
-            <w:r>
-              <w:rPr>
-                <w:rFonts w:cs="Times New Roman"/>
-                <w:sz w:val="24"/>
-                <w:szCs w:val="24"/>
-              </w:rPr>
-              <w:t xml:space="preserve"> из 5 бита </w:t>
-            </w:r>
-            <w:r>
-              <w:rPr>
-                <w:rFonts w:cs="Times New Roman"/>
-                <w:sz w:val="24"/>
-                <w:szCs w:val="24"/>
-                <w:lang w:val="en-US"/>
-              </w:rPr>
-              <w:t>CR</w:t>
-            </w:r>
           </w:p>
         </w:tc>
       </w:tr>
@@ -15369,47 +15284,6 @@
                 <w:szCs w:val="24"/>
               </w:rPr>
               <w:t>Запись требуемого номера регистра</w:t>
-            </w:r>
-            <w:r>
-              <w:rPr>
-                <w:rFonts w:cs="Times New Roman"/>
-                <w:sz w:val="24"/>
-                <w:szCs w:val="24"/>
-              </w:rPr>
-              <w:t xml:space="preserve"> </w:t>
-            </w:r>
-            <w:r>
-              <w:rPr>
-                <w:rFonts w:cs="Times New Roman"/>
-                <w:sz w:val="24"/>
-                <w:szCs w:val="24"/>
-              </w:rPr>
-              <w:t xml:space="preserve">из </w:t>
-            </w:r>
-            <w:r>
-              <w:rPr>
-                <w:rFonts w:cs="Times New Roman"/>
-                <w:sz w:val="24"/>
-                <w:szCs w:val="24"/>
-              </w:rPr>
-              <w:t>4</w:t>
-            </w:r>
-            <w:r>
-              <w:rPr>
-                <w:rFonts w:cs="Times New Roman"/>
-                <w:sz w:val="24"/>
-                <w:szCs w:val="24"/>
-              </w:rPr>
-              <w:t xml:space="preserve"> бита </w:t>
-            </w:r>
-            <w:r>
-              <w:rPr>
-                <w:rFonts w:cs="Times New Roman"/>
-                <w:sz w:val="24"/>
-                <w:szCs w:val="24"/>
-                <w:lang w:val="en-US"/>
-              </w:rPr>
-              <w:t>CR</w:t>
             </w:r>
           </w:p>
         </w:tc>
@@ -16789,31 +16663,6 @@
               </w:rPr>
               <w:t>Запись требуемого номера регистра</w:t>
             </w:r>
-            <w:r>
-              <w:rPr>
-                <w:rFonts w:cs="Times New Roman"/>
-                <w:sz w:val="24"/>
-                <w:szCs w:val="24"/>
-              </w:rPr>
-              <w:t xml:space="preserve"> </w:t>
-            </w:r>
-            <w:r>
-              <w:rPr>
-                <w:rFonts w:cs="Times New Roman"/>
-                <w:sz w:val="24"/>
-                <w:szCs w:val="24"/>
-              </w:rPr>
-              <w:t xml:space="preserve">из 5 бита </w:t>
-            </w:r>
-            <w:r>
-              <w:rPr>
-                <w:rFonts w:cs="Times New Roman"/>
-                <w:sz w:val="24"/>
-                <w:szCs w:val="24"/>
-                <w:lang w:val="en-US"/>
-              </w:rPr>
-              <w:t>CR</w:t>
-            </w:r>
           </w:p>
         </w:tc>
       </w:tr>
@@ -17804,31 +17653,6 @@
               </w:rPr>
               <w:t>Запись требуемого номера регистра</w:t>
             </w:r>
-            <w:r>
-              <w:rPr>
-                <w:rFonts w:cs="Times New Roman"/>
-                <w:sz w:val="24"/>
-                <w:szCs w:val="24"/>
-              </w:rPr>
-              <w:t xml:space="preserve"> </w:t>
-            </w:r>
-            <w:r>
-              <w:rPr>
-                <w:rFonts w:cs="Times New Roman"/>
-                <w:sz w:val="24"/>
-                <w:szCs w:val="24"/>
-              </w:rPr>
-              <w:t xml:space="preserve">из 5 бита </w:t>
-            </w:r>
-            <w:r>
-              <w:rPr>
-                <w:rFonts w:cs="Times New Roman"/>
-                <w:sz w:val="24"/>
-                <w:szCs w:val="24"/>
-                <w:lang w:val="en-US"/>
-              </w:rPr>
-              <w:t>CR</w:t>
-            </w:r>
           </w:p>
         </w:tc>
       </w:tr>
@@ -17845,6 +17669,7 @@
                 <w:rFonts w:cs="Times New Roman"/>
                 <w:sz w:val="24"/>
                 <w:szCs w:val="24"/>
+                <w:lang w:val="en-US"/>
               </w:rPr>
             </w:pPr>
           </w:p>
@@ -17976,7 +17801,44 @@
           <w:szCs w:val="28"/>
           <w:lang w:val="en-US"/>
         </w:rPr>
-        <w:t xml:space="preserve">Start ALU, Acc :=, </w:t>
+        <w:t xml:space="preserve">Start ALU, </w:t>
+      </w:r>
+      <w:proofErr w:type="spellStart"/>
+      <w:proofErr w:type="gramStart"/>
+      <w:r>
+        <w:rPr>
+          <w:rStyle w:val="fontstyle01"/>
+          <w:rFonts w:ascii="Times New Roman" w:hAnsi="Times New Roman" w:cs="Times New Roman"/>
+          <w:color w:val="auto"/>
+          <w:sz w:val="28"/>
+          <w:szCs w:val="28"/>
+          <w:lang w:val="en-US"/>
+        </w:rPr>
+        <w:t>Acc</w:t>
+      </w:r>
+      <w:proofErr w:type="spellEnd"/>
+      <w:r>
+        <w:rPr>
+          <w:rStyle w:val="fontstyle01"/>
+          <w:rFonts w:ascii="Times New Roman" w:hAnsi="Times New Roman" w:cs="Times New Roman"/>
+          <w:color w:val="auto"/>
+          <w:sz w:val="28"/>
+          <w:szCs w:val="28"/>
+          <w:lang w:val="en-US"/>
+        </w:rPr>
+        <w:t xml:space="preserve"> :</w:t>
+      </w:r>
+      <w:proofErr w:type="gramEnd"/>
+      <w:r>
+        <w:rPr>
+          <w:rStyle w:val="fontstyle01"/>
+          <w:rFonts w:ascii="Times New Roman" w:hAnsi="Times New Roman" w:cs="Times New Roman"/>
+          <w:color w:val="auto"/>
+          <w:sz w:val="28"/>
+          <w:szCs w:val="28"/>
+          <w:lang w:val="en-US"/>
+        </w:rPr>
+        <w:t xml:space="preserve">=, </w:t>
       </w:r>
     </w:p>
     <w:p>
@@ -18414,6 +18276,7 @@
         </w:rPr>
         <w:t xml:space="preserve">если в каждой микропрограмме микрокоманду увеличения программного счетчика </w:t>
       </w:r>
+      <w:proofErr w:type="gramStart"/>
       <w:r>
         <w:rPr>
           <w:rStyle w:val="fontstyle01"/>
@@ -18421,7 +18284,17 @@
           <w:sz w:val="28"/>
           <w:szCs w:val="28"/>
         </w:rPr>
-        <w:t xml:space="preserve">PC := </w:t>
+        <w:t>PC :</w:t>
+      </w:r>
+      <w:proofErr w:type="gramEnd"/>
+      <w:r>
+        <w:rPr>
+          <w:rStyle w:val="fontstyle01"/>
+          <w:rFonts w:ascii="Times New Roman" w:hAnsi="Times New Roman" w:cs="Times New Roman"/>
+          <w:sz w:val="28"/>
+          <w:szCs w:val="28"/>
+        </w:rPr>
+        <w:t xml:space="preserve">= </w:t>
       </w:r>
       <w:r>
         <w:rPr>
@@ -18496,7 +18369,16 @@
           <w:rFonts w:cs="Times New Roman"/>
           <w:szCs w:val="28"/>
         </w:rPr>
-        <w:t>Переходы будут работать некорректно и переходить на один больше</w:t>
+        <w:t>Переходы будут работать некорректно и переходить на один бол</w:t>
+      </w:r>
+      <w:bookmarkStart w:id="0" w:name="_GoBack"/>
+      <w:bookmarkEnd w:id="0"/>
+      <w:r>
+        <w:rPr>
+          <w:rFonts w:cs="Times New Roman"/>
+          <w:szCs w:val="28"/>
+        </w:rPr>
+        <w:t>ьше</w:t>
       </w:r>
     </w:p>
     <w:sectPr>
@@ -18510,7 +18392,7 @@
 </file>
 
 <file path=word/numbering.xml><?xml version="1.0" encoding="utf-8"?>
-<w:numbering xmlns:wpc="http://schemas.microsoft.com/office/word/2010/wordprocessingCanvas" xmlns:cx="http://schemas.microsoft.com/office/drawing/2014/chartex" xmlns:cx1="http://schemas.microsoft.com/office/drawing/2015/9/8/chartex" xmlns:cx2="http://schemas.microsoft.com/office/drawing/2015/10/21/chartex" xmlns:cx3="http://schemas.microsoft.com/office/drawing/2016/5/9/chartex" xmlns:cx4="http://schemas.microsoft.com/office/drawing/2016/5/10/chartex" xmlns:cx5="http://schemas.microsoft.com/office/drawing/2016/5/11/chartex" xmlns:cx6="http://schemas.microsoft.com/office/drawing/2016/5/12/chartex" xmlns:cx7="http://schemas.microsoft.com/office/drawing/2016/5/13/chartex" xmlns:cx8="http://schemas.microsoft.com/office/drawing/2016/5/14/chartex" xmlns:mc="http://schemas.openxmlformats.org/markup-compatibility/2006" xmlns:aink="http://schemas.microsoft.com/office/drawing/2016/ink" xmlns:am3d="http://schemas.microsoft.com/office/drawing/2017/model3d" xmlns:o="urn:schemas-microsoft-com:office:office" xmlns:oel="http://schemas.microsoft.com/office/2019/extlst" xmlns:r="http://schemas.openxmlformats.org/officeDocument/2006/relationships" xmlns:m="http://schemas.openxmlformats.org/officeDocument/2006/math" xmlns:v="urn:schemas-microsoft-com:vml" xmlns:wp14="http://schemas.microsoft.com/office/word/2010/wordprocessingDrawing" xmlns:wp="http://schemas.openxmlformats.org/drawingml/2006/wordprocessingDrawing" xmlns:w10="urn:schemas-microsoft-com:office:word" xmlns:w="http://schemas.openxmlformats.org/wordprocessingml/2006/main" xmlns:w14="http://schemas.microsoft.com/office/word/2010/wordml" xmlns:w15="http://schemas.microsoft.com/office/word/2012/wordml" xmlns:w16cex="http://schemas.microsoft.com/office/word/2018/wordml/cex" xmlns:w16cid="http://schemas.microsoft.com/office/word/2016/wordml/cid" xmlns:w16="http://schemas.microsoft.com/office/word/2018/wordml" xmlns:w16du="http://schemas.microsoft.com/office/word/2023/wordml/word16du" xmlns:w16sdtdh="http://schemas.microsoft.com/office/word/2020/wordml/sdtdatahash" xmlns:w16sdtfl="http://schemas.microsoft.com/office/word/2024/wordml/sdtformatlock" xmlns:w16se="http://schemas.microsoft.com/office/word/2015/wordml/symex" xmlns:wpg="http://schemas.microsoft.com/office/word/2010/wordprocessingGroup" xmlns:wpi="http://schemas.microsoft.com/office/word/2010/wordprocessingInk" xmlns:wne="http://schemas.microsoft.com/office/word/2006/wordml" xmlns:wps="http://schemas.microsoft.com/office/word/2010/wordprocessingShape" mc:Ignorable="w14 w15 w16se w16cid w16 w16cex w16sdtdh w16sdtfl w16du wp14">
+<w:numbering xmlns:wpc="http://schemas.microsoft.com/office/word/2010/wordprocessingCanvas" xmlns:cx="http://schemas.microsoft.com/office/drawing/2014/chartex" xmlns:mc="http://schemas.openxmlformats.org/markup-compatibility/2006" xmlns:o="urn:schemas-microsoft-com:office:office" xmlns:r="http://schemas.openxmlformats.org/officeDocument/2006/relationships" xmlns:m="http://schemas.openxmlformats.org/officeDocument/2006/math" xmlns:v="urn:schemas-microsoft-com:vml" xmlns:wp14="http://schemas.microsoft.com/office/word/2010/wordprocessingDrawing" xmlns:wp="http://schemas.openxmlformats.org/drawingml/2006/wordprocessingDrawing" xmlns:w10="urn:schemas-microsoft-com:office:word" xmlns:w="http://schemas.openxmlformats.org/wordprocessingml/2006/main" xmlns:w14="http://schemas.microsoft.com/office/word/2010/wordml" xmlns:w15="http://schemas.microsoft.com/office/word/2012/wordml" xmlns:w16se="http://schemas.microsoft.com/office/word/2015/wordml/symex" xmlns:wpg="http://schemas.microsoft.com/office/word/2010/wordprocessingGroup" xmlns:wpi="http://schemas.microsoft.com/office/word/2010/wordprocessingInk" xmlns:wne="http://schemas.microsoft.com/office/word/2006/wordml" xmlns:wps="http://schemas.microsoft.com/office/word/2010/wordprocessingShape" mc:Ignorable="w14 w15 w16se wp14">
   <w:abstractNum w:abstractNumId="0" w15:restartNumberingAfterBreak="0">
     <w:nsid w:val="0CA71241"/>
     <w:multiLevelType w:val="hybridMultilevel"/>
@@ -18893,23 +18775,23 @@
       </w:pPr>
     </w:lvl>
   </w:abstractNum>
-  <w:num w:numId="1" w16cid:durableId="1984578345">
+  <w:num w:numId="1">
     <w:abstractNumId w:val="2"/>
   </w:num>
-  <w:num w:numId="2" w16cid:durableId="1009718254">
+  <w:num w:numId="2">
     <w:abstractNumId w:val="0"/>
   </w:num>
-  <w:num w:numId="3" w16cid:durableId="335379160">
+  <w:num w:numId="3">
     <w:abstractNumId w:val="3"/>
   </w:num>
-  <w:num w:numId="4" w16cid:durableId="484123945">
+  <w:num w:numId="4">
     <w:abstractNumId w:val="1"/>
   </w:num>
 </w:numbering>
 </file>
 
 <file path=word/styles.xml><?xml version="1.0" encoding="utf-8"?>
-<w:styles xmlns:mc="http://schemas.openxmlformats.org/markup-compatibility/2006" xmlns:r="http://schemas.openxmlformats.org/officeDocument/2006/relationships" xmlns:w="http://schemas.openxmlformats.org/wordprocessingml/2006/main" xmlns:w14="http://schemas.microsoft.com/office/word/2010/wordml" xmlns:w15="http://schemas.microsoft.com/office/word/2012/wordml" xmlns:w16cex="http://schemas.microsoft.com/office/word/2018/wordml/cex" xmlns:w16cid="http://schemas.microsoft.com/office/word/2016/wordml/cid" xmlns:w16="http://schemas.microsoft.com/office/word/2018/wordml" xmlns:w16du="http://schemas.microsoft.com/office/word/2023/wordml/word16du" xmlns:w16sdtdh="http://schemas.microsoft.com/office/word/2020/wordml/sdtdatahash" xmlns:w16sdtfl="http://schemas.microsoft.com/office/word/2024/wordml/sdtformatlock" xmlns:w16se="http://schemas.microsoft.com/office/word/2015/wordml/symex" mc:Ignorable="w14 w15 w16se w16cid w16 w16cex w16sdtdh w16sdtfl w16du">
+<w:styles xmlns:mc="http://schemas.openxmlformats.org/markup-compatibility/2006" xmlns:r="http://schemas.openxmlformats.org/officeDocument/2006/relationships" xmlns:w="http://schemas.openxmlformats.org/wordprocessingml/2006/main" xmlns:w14="http://schemas.microsoft.com/office/word/2010/wordml" xmlns:w15="http://schemas.microsoft.com/office/word/2012/wordml" xmlns:w16se="http://schemas.microsoft.com/office/word/2015/wordml/symex" mc:Ignorable="w14 w15 w16se">
   <w:docDefaults>
     <w:rPrDefault>
       <w:rPr>
@@ -18925,7 +18807,7 @@
       </w:pPr>
     </w:pPrDefault>
   </w:docDefaults>
-  <w:latentStyles w:defLockedState="0" w:defUIPriority="99" w:defSemiHidden="0" w:defUnhideWhenUsed="0" w:defQFormat="0" w:count="376">
+  <w:latentStyles w:defLockedState="0" w:defUIPriority="99" w:defSemiHidden="0" w:defUnhideWhenUsed="0" w:defQFormat="0" w:count="371">
     <w:lsdException w:name="Normal" w:uiPriority="0" w:qFormat="1"/>
     <w:lsdException w:name="heading 1" w:uiPriority="9" w:qFormat="1"/>
     <w:lsdException w:name="heading 2" w:semiHidden="1" w:uiPriority="9" w:unhideWhenUsed="1" w:qFormat="1"/>
@@ -19297,11 +19179,6 @@
     <w:lsdException w:name="List Table 5 Dark Accent 6" w:uiPriority="50"/>
     <w:lsdException w:name="List Table 6 Colorful Accent 6" w:uiPriority="51"/>
     <w:lsdException w:name="List Table 7 Colorful Accent 6" w:uiPriority="52"/>
-    <w:lsdException w:name="Mention" w:semiHidden="1" w:unhideWhenUsed="1"/>
-    <w:lsdException w:name="Smart Hyperlink" w:semiHidden="1" w:unhideWhenUsed="1"/>
-    <w:lsdException w:name="Hashtag" w:semiHidden="1" w:unhideWhenUsed="1"/>
-    <w:lsdException w:name="Unresolved Mention" w:semiHidden="1" w:unhideWhenUsed="1"/>
-    <w:lsdException w:name="Smart Link" w:semiHidden="1" w:unhideWhenUsed="1"/>
   </w:latentStyles>
   <w:style w:type="paragraph" w:default="1" w:styleId="a">
     <w:name w:val="Normal"/>

</xml_diff>